<commit_message>
Add 2026-10-21 project log entry
Requirements v1.3, decision log and first GitHub upload.
</commit_message>
<xml_diff>
--- a/docs/Spot_Project_Log.docx
+++ b/docs/Spot_Project_Log.docx
@@ -12,10 +12,7 @@
     </w:p>
     <w:p>
       <w:r>
-        <w:t xml:space="preserve">Oct 19, 2026 · </w:t>
-      </w:r>
-      <w:r>
-        <w:t>Angel Lopez</w:t>
+        <w:t xml:space="preserve">Oct 19, 2026 · Angel Lopez</w:t>
       </w:r>
     </w:p>
     <w:p>
@@ -134,19 +131,7 @@
         <w:pStyle w:val="Heading3"/>
       </w:pPr>
       <w:r>
-        <w:t xml:space="preserve">2026-10-19 — Backfill: </w:t>
-      </w:r>
-      <w:r>
-        <w:t>How</w:t>
-      </w:r>
-      <w:r>
-        <w:t xml:space="preserve"> Spot </w:t>
-      </w:r>
-      <w:r>
-        <w:t>S</w:t>
-      </w:r>
-      <w:r>
-        <w:t>tarted</w:t>
+        <w:t xml:space="preserve">2026-10-21 — Requirements v1.3, decision log and GitHub</w:t>
       </w:r>
     </w:p>
     <w:p>
@@ -154,6 +139,150 @@
         <w:rPr>
           <w:b/>
         </w:rPr>
+        <w:t xml:space="preserve">What I did</w:t>
+      </w:r>
+    </w:p>
+    <w:p>
+      <w:pPr>
+        <w:rPr>
+          <w:i/>
+        </w:rPr>
+      </w:pPr>
+      <w:r>
+        <w:rPr>
+          <w:i/>
+        </w:rPr>
+        <w:t xml:space="preserve">Wrote Spot — Requirements over two sessions (Oct 20–21), now at v1.3. Every must-have has a number and a way to fail it: R1 counting full reps for the curl, lateral raise and chest press; R2 noise rejection; R3 rest timing; R4 beating my Garmin Forerunner 165; R5 the mode button; R6 rep duration, partial detection and momentum flagging; R7 logging with no USB cable.</w:t>
+      </w:r>
+    </w:p>
+    <w:p>
+      <w:pPr>
+        <w:rPr>
+          <w:i/>
+        </w:rPr>
+      </w:pPr>
+      <w:r>
+        <w:rPr>
+          <w:i/>
+        </w:rPr>
+        <w:t xml:space="preserve">I also added definitions for every term the tests use, plus gym and technical glossaries so someone who doesn't lift can follow along. I started DECISIONS.md, a test log spreadsheet and a data README with a file-naming rule, then pushed everything to GitHub.</w:t>
+      </w:r>
+    </w:p>
+    <w:p>
+      <w:r>
+        <w:rPr>
+          <w:b/>
+        </w:rPr>
+        <w:t xml:space="preserve">What happened</w:t>
+      </w:r>
+    </w:p>
+    <w:p>
+      <w:pPr>
+        <w:rPr>
+          <w:i/>
+        </w:rPr>
+      </w:pPr>
+      <w:r>
+        <w:rPr>
+          <w:i/>
+        </w:rPr>
+        <w:t xml:space="preserve">Main decisions: video is the ground truth, and I count reps before looking at Spot's number. Only held-out sets, recorded after the counter is frozen with a Git tag, are scored. Rep count must be within ±1 on 90% of sets and ±2 on every set, over 27 sets per exercise: 3 speeds × clean, momentum and mixed sets, split across both hands.</w:t>
+      </w:r>
+    </w:p>
+    <w:p>
+      <w:pPr>
+        <w:rPr>
+          <w:i/>
+        </w:rPr>
+      </w:pPr>
+      <w:r>
+        <w:rPr>
+          <w:i/>
+        </w:rPr>
+        <w:t xml:space="preserve">Partial reps don't count, but Spot flags them. Momentum reps count, and Spot flags them too. Rest must be within ±5 s, and Spot must count zero reps on 20 noise sets per mode. v1 is tested at home on my own dumbbells but has to work as if it were at a gym; making it gym-ready is the goal for v2.</w:t>
+      </w:r>
+    </w:p>
+    <w:p>
+      <w:pPr>
+        <w:rPr>
+          <w:i/>
+        </w:rPr>
+      </w:pPr>
+      <w:r>
+        <w:rPr>
+          <w:i/>
+        </w:rPr>
+        <w:t xml:space="preserve">The mount plan changed to a steel plate stuck to the end face with VHB tape and held by magnets, after a fridge magnet didn't hold and the strap socket blocked my grip. Checking my recordings, the XIAO logger runs at 100 Hz, and gyro Z carries the curl at about 4.5–5× the next axis across full sets.</w:t>
+      </w:r>
+    </w:p>
+    <w:p>
+      <w:r>
+        <w:rPr>
+          <w:b/>
+        </w:rPr>
+        <w:t xml:space="preserve">What I learned / what broke</w:t>
+      </w:r>
+    </w:p>
+    <w:p>
+      <w:pPr>
+        <w:rPr>
+          <w:i/>
+        </w:rPr>
+      </w:pPr>
+      <w:r>
+        <w:rPr>
+          <w:i/>
+        </w:rPr>
+        <w:t xml:space="preserve">Writing "how I'll test it" for each requirement exposed gaps: rest had no defined start or end, the press had a zone between "partial" and "full" that was neither, and 18 test sets meant 90% actually required 17 of 18. Tuning and scoring on the same data would overstate accuracy, which is why the frozen-counter rule exists.</w:t>
+      </w:r>
+    </w:p>
+    <w:p>
+      <w:pPr>
+        <w:rPr>
+          <w:i/>
+        </w:rPr>
+      </w:pPr>
+      <w:r>
+        <w:rPr>
+          <w:i/>
+        </w:rPr>
+        <w:t xml:space="preserve">Deciding that partials don't count made the press the riskiest part of v1: Spot has to tell a full press from a partial using only the accelerometer, since the press doesn't rotate. The 2 MB on-board flash holds only about 22–29 minutes of raw data, so a full test session might not fit.</w:t>
+      </w:r>
+    </w:p>
+    <w:p>
+      <w:r>
+        <w:rPr>
+          <w:b/>
+        </w:rPr>
+        <w:t xml:space="preserve">Next step</w:t>
+      </w:r>
+    </w:p>
+    <w:p>
+      <w:pPr>
+        <w:rPr>
+          <w:i/>
+        </w:rPr>
+      </w:pPr>
+      <w:r>
+        <w:rPr>
+          <w:i/>
+        </w:rPr>
+        <w:t xml:space="preserve">Record USB tuning data for the lateral raise and chest press, and check the press data first to see whether full and partial presses can be told apart.</w:t>
+      </w:r>
+    </w:p>
+    <w:p>
+      <w:pPr>
+        <w:pStyle w:val="Heading3"/>
+      </w:pPr>
+      <w:r>
+        <w:t xml:space="preserve">2026-10-19 — Backfill: How Spot Started</w:t>
+      </w:r>
+    </w:p>
+    <w:p>
+      <w:r>
+        <w:rPr>
+          <w:b/>
+        </w:rPr>
         <w:t>What I did</w:t>
       </w:r>
     </w:p>
@@ -180,25 +309,7 @@
         <w:rPr>
           <w:i/>
         </w:rPr>
-        <w:t>I tried using my fitness watch</w:t>
-      </w:r>
-      <w:r>
-        <w:rPr>
-          <w:i/>
-        </w:rPr>
-        <w:t xml:space="preserve">’s </w:t>
-      </w:r>
-      <w:r>
-        <w:rPr>
-          <w:i/>
-        </w:rPr>
-        <w:t xml:space="preserve">workout feature, but it provided inaccurate results. </w:t>
-      </w:r>
-      <w:r>
-        <w:rPr>
-          <w:i/>
-        </w:rPr>
-        <w:t xml:space="preserve">The nature of wearables makes it difficult for them to count accurately, as they focus on wrist/arm movement and cannot ‘see’ the weight move. I decided that a wearable could potentially repeat the same problems I had already experienced. </w:t>
+        <w:t xml:space="preserve">I tried using my fitness watch’s workout feature, but it provided inaccurate results. The nature of wearables makes it difficult for them to count accurately, as they focus on wrist/arm movement and cannot ‘see’ the weight move. I decided that a wearable could potentially repeat the same problems I had already experienced. </w:t>
       </w:r>
     </w:p>
     <w:p>
@@ -212,11 +323,6 @@
           <w:i/>
         </w:rPr>
         <w:t xml:space="preserve">This is when the idea to create a mountable device that does the counting for me was born. At first, the device was purely meant to count reps, but this didn’t seem worth the trouble as I could just record the </w:t>
-      </w:r>
-      <w:r>
-        <w:rPr>
-          <w:i/>
-        </w:rPr>
         <w:lastRenderedPageBreak/>
         <w:t xml:space="preserve">set or get used to counting. To justify the project, I began thinking about other problems I have in the gym. </w:t>
       </w:r>
@@ -244,32 +350,20 @@
         <w:rPr>
           <w:i/>
         </w:rPr>
-        <w:t xml:space="preserve">After researching similar products to perform a ‘competitor analysis’, I found similar products that provided some features that I wanted. </w:t>
-      </w:r>
-      <w:r>
-        <w:rPr>
-          <w:i/>
-        </w:rPr>
-        <w:t>While the products could potentially be seen as competitors, none of them combined all the features in one device.</w:t>
-      </w:r>
-    </w:p>
-    <w:p>
-      <w:pPr>
-        <w:rPr>
-          <w:i/>
-        </w:rPr>
-      </w:pPr>
-      <w:r>
-        <w:rPr>
-          <w:i/>
-        </w:rPr>
-        <w:t xml:space="preserve">Rogo, a device created at my school Texas A&amp;M, was a similar product but was vague about its metrics, claiming that it uses ‘AI’ to track workouts. Additionally, its snap-on nature can get in the way during certain exercises, or flat out not work. </w:t>
-      </w:r>
-      <w:r>
-        <w:rPr>
-          <w:i/>
-        </w:rPr>
-        <w:t>This flaw inspired my idea to create swappable mounts for my device.</w:t>
+        <w:t xml:space="preserve">After researching similar products to perform a ‘competitor analysis’, I found similar products that provided some features that I wanted. While the products could potentially be seen as competitors, none of them combined all the features in one device.</w:t>
+      </w:r>
+    </w:p>
+    <w:p>
+      <w:pPr>
+        <w:rPr>
+          <w:i/>
+        </w:rPr>
+      </w:pPr>
+      <w:r>
+        <w:rPr>
+          <w:i/>
+        </w:rPr>
+        <w:t xml:space="preserve">Rogo, a device created at my school Texas A&amp;M, was a similar product but was vague about its metrics, claiming that it uses ‘AI’ to track workouts. Additionally, its snap-on nature can get in the way during certain exercises, or flat out not work. This flaw inspired my idea to create swappable mounts for my device.</w:t>
       </w:r>
     </w:p>
     <w:p>
@@ -295,111 +389,33 @@
         <w:rPr>
           <w:i/>
         </w:rPr>
-        <w:t xml:space="preserve">I wanted to create the project </w:t>
-      </w:r>
-      <w:r>
-        <w:rPr>
-          <w:i/>
-        </w:rPr>
-        <w:t>myself so I could understand the architecture behind this type of device, and fix problems that I have personally experienced at the gym. Additionally, understanding the mechanics behind the device allows me to add features and understand my own workouts more.</w:t>
-      </w:r>
-    </w:p>
-    <w:p>
-      <w:pPr>
-        <w:rPr>
-          <w:i/>
-        </w:rPr>
-      </w:pPr>
-      <w:r>
-        <w:rPr>
-          <w:i/>
-        </w:rPr>
-        <w:t xml:space="preserve">Tracking your progress in the gym is important, and this extends beyond just the number of reps performed. I wanted to create a device that keeps me accountable and informed, not just for the number of reps but how those reps are performed. </w:t>
-      </w:r>
-      <w:r>
-        <w:rPr>
-          <w:i/>
-        </w:rPr>
-        <w:t xml:space="preserve">My device, Spot, will track metrics based on </w:t>
-      </w:r>
-      <w:r>
-        <w:rPr>
-          <w:i/>
-        </w:rPr>
-        <w:t>four</w:t>
-      </w:r>
-      <w:r>
-        <w:rPr>
-          <w:i/>
-        </w:rPr>
-        <w:t xml:space="preserve"> core facets: position, acceleration,</w:t>
-      </w:r>
-      <w:r>
-        <w:rPr>
-          <w:i/>
-        </w:rPr>
-        <w:t xml:space="preserve"> rotation,</w:t>
-      </w:r>
-      <w:r>
-        <w:rPr>
-          <w:i/>
-        </w:rPr>
-        <w:t xml:space="preserve"> and velocity. From these metrics, the device will be able to </w:t>
-      </w:r>
-      <w:r>
-        <w:rPr>
-          <w:i/>
-        </w:rPr>
-        <w:t>count reps, measure tempo, time rest, and check form.</w:t>
-      </w:r>
-    </w:p>
-    <w:p>
-      <w:pPr>
-        <w:rPr>
-          <w:i/>
-        </w:rPr>
-      </w:pPr>
-      <w:r>
-        <w:rPr>
-          <w:i/>
-        </w:rPr>
-        <w:t>The goal for the initial prototype is to</w:t>
-      </w:r>
-      <w:r>
-        <w:rPr>
-          <w:i/>
-        </w:rPr>
-        <w:t xml:space="preserve"> </w:t>
-      </w:r>
-      <w:r>
-        <w:rPr>
-          <w:i/>
-        </w:rPr>
-        <w:t xml:space="preserve">count rep and rest times </w:t>
-      </w:r>
-      <w:r>
-        <w:rPr>
-          <w:i/>
-        </w:rPr>
-        <w:t xml:space="preserve">correctly against video, and more accurately than a </w:t>
-      </w:r>
-      <w:r>
-        <w:rPr>
-          <w:i/>
-        </w:rPr>
-        <w:t>fitness watch. You shouldn’t have to worry about numbers in the gy</w:t>
-      </w:r>
-      <w:r>
-        <w:rPr>
-          <w:i/>
-        </w:rPr>
-        <w:t>m;</w:t>
-      </w:r>
-      <w:r>
-        <w:rPr>
-          <w:i/>
-        </w:rPr>
-        <w:t xml:space="preserve"> let Spot do the heavy lifting for you.</w:t>
+        <w:t xml:space="preserve">I wanted to create the project myself so I could understand the architecture behind this type of device, and fix problems that I have personally experienced at the gym. Additionally, understanding the mechanics behind the device allows me to add features and understand my own workouts more.</w:t>
+      </w:r>
+    </w:p>
+    <w:p>
+      <w:pPr>
+        <w:rPr>
+          <w:i/>
+        </w:rPr>
+      </w:pPr>
+      <w:r>
+        <w:rPr>
+          <w:i/>
+        </w:rPr>
+        <w:t xml:space="preserve">Tracking your progress in the gym is important, and this extends beyond just the number of reps performed. I wanted to create a device that keeps me accountable and informed, not just for the number of reps but how those reps are performed. My device, Spot, will track metrics based on four core facets: position, acceleration, rotation, and velocity. From these metrics, the device will be able to count reps, measure tempo, time rest, and check form.</w:t>
+      </w:r>
+    </w:p>
+    <w:p>
+      <w:pPr>
+        <w:rPr>
+          <w:i/>
+        </w:rPr>
+      </w:pPr>
+      <w:r>
+        <w:rPr>
+          <w:i/>
+        </w:rPr>
+        <w:t xml:space="preserve">The goal for the initial prototype is to count rep and rest times correctly against video, and more accurately than a fitness watch. You shouldn’t have to worry about numbers in the gym; let Spot do the heavy lifting for you.</w:t>
       </w:r>
     </w:p>
     <w:p/>

</xml_diff>